<commit_message>
chore: sincroniza desde la carpeta del módulo
Actualización del proyecto de referencia PROYECTO_VIDEOJUEGO.
</commit_message>
<xml_diff>
--- a/documentacion/Guia_Despliegue_y_Ejercicios_Videojuego.docx
+++ b/documentacion/Guia_Despliegue_y_Ejercicios_Videojuego.docx
@@ -587,6 +587,1362 @@
     </w:p>
     <w:p>
       <w:pPr>
+        <w:pStyle w:val="Heading2"/>
+      </w:pPr>
+      <w:r>
+        <w:t>Dentro del backend: mapa de módulos</w:t>
+      </w:r>
+    </w:p>
+    <w:p>
+      <w:pPr>
+        <w:spacing w:after="120"/>
+      </w:pPr>
+      <w:r>
+        <w:rPr/>
+        <w:t xml:space="preserve">Lo anterior describe los cuatro </w:t>
+      </w:r>
+      <w:r>
+        <w:rPr>
+          <w:b/>
+        </w:rPr>
+        <w:t>servicios</w:t>
+      </w:r>
+      <w:r>
+        <w:rPr/>
+        <w:t xml:space="preserve"> del </w:t>
+      </w:r>
+      <w:r>
+        <w:rPr>
+          <w:rFonts w:ascii="Consolas" w:hAnsi="Consolas" w:cs="Consolas"/>
+          <w:sz w:val="19"/>
+        </w:rPr>
+        <w:t>docker-compose.yml</w:t>
+      </w:r>
+      <w:r>
+        <w:rPr/>
+        <w:t xml:space="preserve">. Este apartado baja un nivel: qué ficheros hay dentro del servicio </w:t>
+      </w:r>
+      <w:r>
+        <w:rPr>
+          <w:rFonts w:ascii="Consolas" w:hAnsi="Consolas" w:cs="Consolas"/>
+          <w:sz w:val="19"/>
+        </w:rPr>
+        <w:t>backend</w:t>
+      </w:r>
+      <w:r>
+        <w:rPr/>
+        <w:t xml:space="preserve"> y quién importa a quién.</w:t>
+      </w:r>
+    </w:p>
+    <w:p>
+      <w:pPr>
+        <w:spacing w:after="120"/>
+      </w:pPr>
+      <w:r>
+        <w:rPr/>
+        <w:t xml:space="preserve">Una flecha significa que el módulo de arriba hace un </w:t>
+      </w:r>
+      <w:r>
+        <w:rPr>
+          <w:rFonts w:ascii="Consolas" w:hAnsi="Consolas" w:cs="Consolas"/>
+          <w:sz w:val="19"/>
+        </w:rPr>
+        <w:t>require()</w:t>
+      </w:r>
+      <w:r>
+        <w:rPr/>
+        <w:t xml:space="preserve"> del de abajo. Lo primero que salta a la vista es que </w:t>
+      </w:r>
+      <w:r>
+        <w:rPr>
+          <w:b/>
+        </w:rPr>
+        <w:t>la API REST es la parte pequeña</w:t>
+      </w:r>
+      <w:r>
+        <w:rPr/>
+        <w:t>: casi todo el juego ocurre por WebSocket.</w:t>
+      </w:r>
+    </w:p>
+    <w:p>
+      <w:pPr>
+        <w:spacing w:before="160" w:after="40"/>
+        <w:jc w:val="center"/>
+      </w:pPr>
+      <w:r>
+        <w:drawing>
+          <wp:inline xmlns:a="http://schemas.openxmlformats.org/drawingml/2006/main" xmlns:pic="http://schemas.openxmlformats.org/drawingml/2006/picture">
+            <wp:extent cx="5580000" cy="3234103"/>
+            <wp:docPr id="1" name="Picture 1"/>
+            <wp:cNvGraphicFramePr>
+              <a:graphicFrameLocks noChangeAspect="1"/>
+            </wp:cNvGraphicFramePr>
+            <a:graphic>
+              <a:graphicData uri="http://schemas.openxmlformats.org/drawingml/2006/picture">
+                <pic:pic>
+                  <pic:nvPicPr>
+                    <pic:cNvPr id="0" name="modulos_arena.png"/>
+                    <pic:cNvPicPr/>
+                  </pic:nvPicPr>
+                  <pic:blipFill>
+                    <a:blip r:embed="rId8"/>
+                    <a:stretch>
+                      <a:fillRect/>
+                    </a:stretch>
+                  </pic:blipFill>
+                  <pic:spPr>
+                    <a:xfrm>
+                      <a:off x="0" y="0"/>
+                      <a:ext cx="5580000" cy="3234103"/>
+                    </a:xfrm>
+                    <a:prstGeom prst="rect"/>
+                  </pic:spPr>
+                </pic:pic>
+              </a:graphicData>
+            </a:graphic>
+          </wp:inline>
+        </w:drawing>
+      </w:r>
+    </w:p>
+    <w:p>
+      <w:pPr>
+        <w:spacing w:after="240"/>
+        <w:jc w:val="center"/>
+      </w:pPr>
+      <w:r>
+        <w:rPr>
+          <w:i/>
+          <w:color w:val="595959"/>
+          <w:sz w:val="17"/>
+        </w:rPr>
+        <w:t>config.js se dibuja aparte porque lo importan casi todos. Fíjate en que matchmaking.js no importa Socket.IO: se comunica con sockets.js a través de Redis.</w:t>
+      </w:r>
+    </w:p>
+    <w:tbl>
+      <w:tblPr>
+        <w:tblW w:type="auto" w:w="0"/>
+        <w:tblLook w:firstColumn="1" w:firstRow="1" w:lastColumn="0" w:lastRow="0" w:noHBand="0" w:noVBand="1" w:val="04A0"/>
+        <w:tblBorders>
+          <w:top w:val="single" w:sz="4" w:space="0" w:color="A0A0A0"/>
+          <w:left w:val="single" w:sz="4" w:space="0" w:color="A0A0A0"/>
+          <w:bottom w:val="single" w:sz="4" w:space="0" w:color="A0A0A0"/>
+          <w:right w:val="single" w:sz="4" w:space="0" w:color="A0A0A0"/>
+          <w:insideH w:val="single" w:sz="4" w:space="0" w:color="A0A0A0"/>
+          <w:insideV w:val="single" w:sz="4" w:space="0" w:color="A0A0A0"/>
+        </w:tblBorders>
+      </w:tblPr>
+      <w:tblGrid>
+        <w:gridCol w:w="3009"/>
+        <w:gridCol w:w="3009"/>
+        <w:gridCol w:w="3009"/>
+      </w:tblGrid>
+      <w:tr>
+        <w:trPr>
+          <w:tblHeader w:val="true"/>
+        </w:trPr>
+        <w:tc>
+          <w:tcPr>
+            <w:tcW w:type="dxa" w:w="1814"/>
+            <w:shd w:val="clear" w:color="auto" w:fill="D9E7F5"/>
+          </w:tcPr>
+          <w:p>
+            <w:pPr>
+              <w:spacing w:before="40" w:after="40"/>
+            </w:pPr>
+            <w:r>
+              <w:rPr>
+                <w:b/>
+                <w:color w:val="1F4E78"/>
+                <w:sz w:val="18"/>
+              </w:rPr>
+              <w:t>Módulo</w:t>
+            </w:r>
+          </w:p>
+        </w:tc>
+        <w:tc>
+          <w:tcPr>
+            <w:tcW w:type="dxa" w:w="5102"/>
+            <w:shd w:val="clear" w:color="auto" w:fill="D9E7F5"/>
+          </w:tcPr>
+          <w:p>
+            <w:pPr>
+              <w:spacing w:before="40" w:after="40"/>
+            </w:pPr>
+            <w:r>
+              <w:rPr>
+                <w:b/>
+                <w:color w:val="1F4E78"/>
+                <w:sz w:val="18"/>
+              </w:rPr>
+              <w:t>De qué se ocupa</w:t>
+            </w:r>
+          </w:p>
+        </w:tc>
+        <w:tc>
+          <w:tcPr>
+            <w:tcW w:type="dxa" w:w="2098"/>
+            <w:shd w:val="clear" w:color="auto" w:fill="D9E7F5"/>
+          </w:tcPr>
+          <w:p>
+            <w:pPr>
+              <w:spacing w:before="40" w:after="40"/>
+            </w:pPr>
+            <w:r>
+              <w:rPr>
+                <w:b/>
+                <w:color w:val="1F4E78"/>
+                <w:sz w:val="18"/>
+              </w:rPr>
+              <w:t>Importa a</w:t>
+            </w:r>
+          </w:p>
+        </w:tc>
+      </w:tr>
+      <w:tr>
+        <w:tc>
+          <w:tcPr>
+            <w:tcW w:type="dxa" w:w="1814"/>
+          </w:tcPr>
+          <w:p>
+            <w:pPr>
+              <w:spacing w:before="40" w:after="40"/>
+            </w:pPr>
+            <w:r>
+              <w:rPr>
+                <w:rFonts w:ascii="Consolas" w:hAnsi="Consolas" w:cs="Consolas"/>
+                <w:sz w:val="18"/>
+              </w:rPr>
+              <w:t>server.js</w:t>
+            </w:r>
+          </w:p>
+        </w:tc>
+        <w:tc>
+          <w:tcPr>
+            <w:tcW w:type="dxa" w:w="5102"/>
+          </w:tcPr>
+          <w:p>
+            <w:pPr>
+              <w:spacing w:before="40" w:after="40"/>
+            </w:pPr>
+            <w:r>
+              <w:rPr>
+                <w:sz w:val="18"/>
+              </w:rPr>
+              <w:t>Punto de entrada: monta Express, engancha Socket.IO, inicializa el esquema de Postgres y arranca el bucle de emparejamiento.</w:t>
+            </w:r>
+          </w:p>
+        </w:tc>
+        <w:tc>
+          <w:tcPr>
+            <w:tcW w:type="dxa" w:w="2098"/>
+          </w:tcPr>
+          <w:p>
+            <w:pPr>
+              <w:spacing w:before="40" w:after="40"/>
+            </w:pPr>
+            <w:r>
+              <w:rPr>
+                <w:rFonts w:ascii="Consolas" w:hAnsi="Consolas" w:cs="Consolas"/>
+                <w:sz w:val="18"/>
+              </w:rPr>
+              <w:t>app</w:t>
+            </w:r>
+            <w:r>
+              <w:rPr>
+                <w:sz w:val="18"/>
+              </w:rPr>
+              <w:t xml:space="preserve">, </w:t>
+            </w:r>
+            <w:r>
+              <w:rPr>
+                <w:rFonts w:ascii="Consolas" w:hAnsi="Consolas" w:cs="Consolas"/>
+                <w:sz w:val="18"/>
+              </w:rPr>
+              <w:t>config</w:t>
+            </w:r>
+            <w:r>
+              <w:rPr>
+                <w:sz w:val="18"/>
+              </w:rPr>
+              <w:t xml:space="preserve">, </w:t>
+            </w:r>
+            <w:r>
+              <w:rPr>
+                <w:rFonts w:ascii="Consolas" w:hAnsi="Consolas" w:cs="Consolas"/>
+                <w:sz w:val="18"/>
+              </w:rPr>
+              <w:t>db</w:t>
+            </w:r>
+            <w:r>
+              <w:rPr>
+                <w:sz w:val="18"/>
+              </w:rPr>
+              <w:t xml:space="preserve">, </w:t>
+            </w:r>
+            <w:r>
+              <w:rPr>
+                <w:rFonts w:ascii="Consolas" w:hAnsi="Consolas" w:cs="Consolas"/>
+                <w:sz w:val="18"/>
+              </w:rPr>
+              <w:t>matchmaking</w:t>
+            </w:r>
+            <w:r>
+              <w:rPr>
+                <w:sz w:val="18"/>
+              </w:rPr>
+              <w:t xml:space="preserve">, </w:t>
+            </w:r>
+            <w:r>
+              <w:rPr>
+                <w:rFonts w:ascii="Consolas" w:hAnsi="Consolas" w:cs="Consolas"/>
+                <w:sz w:val="18"/>
+              </w:rPr>
+              <w:t>sockets</w:t>
+            </w:r>
+          </w:p>
+        </w:tc>
+      </w:tr>
+      <w:tr>
+        <w:tc>
+          <w:tcPr>
+            <w:tcW w:type="dxa" w:w="1814"/>
+          </w:tcPr>
+          <w:p>
+            <w:pPr>
+              <w:spacing w:before="40" w:after="40"/>
+            </w:pPr>
+            <w:r>
+              <w:rPr>
+                <w:rFonts w:ascii="Consolas" w:hAnsi="Consolas" w:cs="Consolas"/>
+                <w:sz w:val="18"/>
+              </w:rPr>
+              <w:t>app.js</w:t>
+            </w:r>
+          </w:p>
+        </w:tc>
+        <w:tc>
+          <w:tcPr>
+            <w:tcW w:type="dxa" w:w="5102"/>
+          </w:tcPr>
+          <w:p>
+            <w:pPr>
+              <w:spacing w:before="40" w:after="40"/>
+            </w:pPr>
+            <w:r>
+              <w:rPr>
+                <w:sz w:val="18"/>
+              </w:rPr>
+              <w:t>Construye la aplicación de Express. No abre puerto.</w:t>
+            </w:r>
+          </w:p>
+        </w:tc>
+        <w:tc>
+          <w:tcPr>
+            <w:tcW w:type="dxa" w:w="2098"/>
+          </w:tcPr>
+          <w:p>
+            <w:pPr>
+              <w:spacing w:before="40" w:after="40"/>
+            </w:pPr>
+            <w:r>
+              <w:rPr>
+                <w:rFonts w:ascii="Consolas" w:hAnsi="Consolas" w:cs="Consolas"/>
+                <w:sz w:val="18"/>
+              </w:rPr>
+              <w:t>metrics</w:t>
+            </w:r>
+            <w:r>
+              <w:rPr>
+                <w:sz w:val="18"/>
+              </w:rPr>
+              <w:t xml:space="preserve">, </w:t>
+            </w:r>
+            <w:r>
+              <w:rPr>
+                <w:rFonts w:ascii="Consolas" w:hAnsi="Consolas" w:cs="Consolas"/>
+                <w:sz w:val="18"/>
+              </w:rPr>
+              <w:t>routes</w:t>
+            </w:r>
+          </w:p>
+        </w:tc>
+      </w:tr>
+      <w:tr>
+        <w:tc>
+          <w:tcPr>
+            <w:tcW w:type="dxa" w:w="1814"/>
+          </w:tcPr>
+          <w:p>
+            <w:pPr>
+              <w:spacing w:before="40" w:after="40"/>
+            </w:pPr>
+            <w:r>
+              <w:rPr>
+                <w:rFonts w:ascii="Consolas" w:hAnsi="Consolas" w:cs="Consolas"/>
+                <w:sz w:val="18"/>
+              </w:rPr>
+              <w:t>routes.js</w:t>
+            </w:r>
+          </w:p>
+        </w:tc>
+        <w:tc>
+          <w:tcPr>
+            <w:tcW w:type="dxa" w:w="5102"/>
+          </w:tcPr>
+          <w:p>
+            <w:pPr>
+              <w:spacing w:before="40" w:after="40"/>
+            </w:pPr>
+            <w:r>
+              <w:rPr>
+                <w:sz w:val="18"/>
+              </w:rPr>
+              <w:t xml:space="preserve">Lo que </w:t>
+            </w:r>
+            <w:r>
+              <w:rPr>
+                <w:b/>
+                <w:sz w:val="18"/>
+              </w:rPr>
+              <w:t>no</w:t>
+            </w:r>
+            <w:r>
+              <w:rPr>
+                <w:sz w:val="18"/>
+              </w:rPr>
+              <w:t xml:space="preserve"> necesita tiempo real: registro de jugador, perfil y leaderboard.</w:t>
+            </w:r>
+          </w:p>
+        </w:tc>
+        <w:tc>
+          <w:tcPr>
+            <w:tcW w:type="dxa" w:w="2098"/>
+          </w:tcPr>
+          <w:p>
+            <w:pPr>
+              <w:spacing w:before="40" w:after="40"/>
+            </w:pPr>
+            <w:r>
+              <w:rPr>
+                <w:rFonts w:ascii="Consolas" w:hAnsi="Consolas" w:cs="Consolas"/>
+                <w:sz w:val="18"/>
+              </w:rPr>
+              <w:t>auth</w:t>
+            </w:r>
+            <w:r>
+              <w:rPr>
+                <w:sz w:val="18"/>
+              </w:rPr>
+              <w:t xml:space="preserve">, </w:t>
+            </w:r>
+            <w:r>
+              <w:rPr>
+                <w:rFonts w:ascii="Consolas" w:hAnsi="Consolas" w:cs="Consolas"/>
+                <w:sz w:val="18"/>
+              </w:rPr>
+              <w:t>config</w:t>
+            </w:r>
+            <w:r>
+              <w:rPr>
+                <w:sz w:val="18"/>
+              </w:rPr>
+              <w:t xml:space="preserve">, </w:t>
+            </w:r>
+            <w:r>
+              <w:rPr>
+                <w:rFonts w:ascii="Consolas" w:hAnsi="Consolas" w:cs="Consolas"/>
+                <w:sz w:val="18"/>
+              </w:rPr>
+              <w:t>db</w:t>
+            </w:r>
+            <w:r>
+              <w:rPr>
+                <w:sz w:val="18"/>
+              </w:rPr>
+              <w:t xml:space="preserve">, </w:t>
+            </w:r>
+            <w:r>
+              <w:rPr>
+                <w:rFonts w:ascii="Consolas" w:hAnsi="Consolas" w:cs="Consolas"/>
+                <w:sz w:val="18"/>
+              </w:rPr>
+              <w:t>redisClient</w:t>
+            </w:r>
+          </w:p>
+        </w:tc>
+      </w:tr>
+      <w:tr>
+        <w:tc>
+          <w:tcPr>
+            <w:tcW w:type="dxa" w:w="1814"/>
+          </w:tcPr>
+          <w:p>
+            <w:pPr>
+              <w:spacing w:before="40" w:after="40"/>
+            </w:pPr>
+            <w:r>
+              <w:rPr>
+                <w:rFonts w:ascii="Consolas" w:hAnsi="Consolas" w:cs="Consolas"/>
+                <w:sz w:val="18"/>
+              </w:rPr>
+              <w:t>sockets.js</w:t>
+            </w:r>
+          </w:p>
+        </w:tc>
+        <w:tc>
+          <w:tcPr>
+            <w:tcW w:type="dxa" w:w="5102"/>
+          </w:tcPr>
+          <w:p>
+            <w:pPr>
+              <w:spacing w:before="40" w:after="40"/>
+            </w:pPr>
+            <w:r>
+              <w:rPr>
+                <w:sz w:val="18"/>
+              </w:rPr>
+              <w:t xml:space="preserve">Socket.IO: autentica la conexión, gestiona los eventos de partida y retransmite a los jugadores conectados </w:t>
+            </w:r>
+            <w:r>
+              <w:rPr>
+                <w:b/>
+                <w:sz w:val="18"/>
+              </w:rPr>
+              <w:t>a esta réplica</w:t>
+            </w:r>
+            <w:r>
+              <w:rPr>
+                <w:sz w:val="18"/>
+              </w:rPr>
+              <w:t xml:space="preserve"> lo que llega por el pub/sub de Redis.</w:t>
+            </w:r>
+          </w:p>
+        </w:tc>
+        <w:tc>
+          <w:tcPr>
+            <w:tcW w:type="dxa" w:w="2098"/>
+          </w:tcPr>
+          <w:p>
+            <w:pPr>
+              <w:spacing w:before="40" w:after="40"/>
+            </w:pPr>
+            <w:r>
+              <w:rPr>
+                <w:rFonts w:ascii="Consolas" w:hAnsi="Consolas" w:cs="Consolas"/>
+                <w:sz w:val="18"/>
+              </w:rPr>
+              <w:t>auth</w:t>
+            </w:r>
+            <w:r>
+              <w:rPr>
+                <w:sz w:val="18"/>
+              </w:rPr>
+              <w:t xml:space="preserve">, </w:t>
+            </w:r>
+            <w:r>
+              <w:rPr>
+                <w:rFonts w:ascii="Consolas" w:hAnsi="Consolas" w:cs="Consolas"/>
+                <w:sz w:val="18"/>
+              </w:rPr>
+              <w:t>config</w:t>
+            </w:r>
+            <w:r>
+              <w:rPr>
+                <w:sz w:val="18"/>
+              </w:rPr>
+              <w:t xml:space="preserve">, </w:t>
+            </w:r>
+            <w:r>
+              <w:rPr>
+                <w:rFonts w:ascii="Consolas" w:hAnsi="Consolas" w:cs="Consolas"/>
+                <w:sz w:val="18"/>
+              </w:rPr>
+              <w:t>matchmaking</w:t>
+            </w:r>
+            <w:r>
+              <w:rPr>
+                <w:sz w:val="18"/>
+              </w:rPr>
+              <w:t xml:space="preserve">, </w:t>
+            </w:r>
+            <w:r>
+              <w:rPr>
+                <w:rFonts w:ascii="Consolas" w:hAnsi="Consolas" w:cs="Consolas"/>
+                <w:sz w:val="18"/>
+              </w:rPr>
+              <w:t>metrics</w:t>
+            </w:r>
+            <w:r>
+              <w:rPr>
+                <w:sz w:val="18"/>
+              </w:rPr>
+              <w:t xml:space="preserve">, </w:t>
+            </w:r>
+            <w:r>
+              <w:rPr>
+                <w:rFonts w:ascii="Consolas" w:hAnsi="Consolas" w:cs="Consolas"/>
+                <w:sz w:val="18"/>
+              </w:rPr>
+              <w:t>redisClient</w:t>
+            </w:r>
+          </w:p>
+        </w:tc>
+      </w:tr>
+      <w:tr>
+        <w:tc>
+          <w:tcPr>
+            <w:tcW w:type="dxa" w:w="1814"/>
+          </w:tcPr>
+          <w:p>
+            <w:pPr>
+              <w:spacing w:before="40" w:after="40"/>
+            </w:pPr>
+            <w:r>
+              <w:rPr>
+                <w:rFonts w:ascii="Consolas" w:hAnsi="Consolas" w:cs="Consolas"/>
+                <w:sz w:val="18"/>
+              </w:rPr>
+              <w:t>matchmaking.js</w:t>
+            </w:r>
+          </w:p>
+        </w:tc>
+        <w:tc>
+          <w:tcPr>
+            <w:tcW w:type="dxa" w:w="5102"/>
+          </w:tcPr>
+          <w:p>
+            <w:pPr>
+              <w:spacing w:before="40" w:after="40"/>
+            </w:pPr>
+            <w:r>
+              <w:rPr>
+                <w:sz w:val="18"/>
+              </w:rPr>
+              <w:t xml:space="preserve">Emparejamiento y ciclo de vida de una partida. </w:t>
+            </w:r>
+            <w:r>
+              <w:rPr>
+                <w:b/>
+                <w:sz w:val="18"/>
+              </w:rPr>
+              <w:t>No depende de Socket.IO</w:t>
+            </w:r>
+            <w:r>
+              <w:rPr>
+                <w:sz w:val="18"/>
+              </w:rPr>
+              <w:t>: solo lee y escribe en Redis y Postgres, y publica eventos.</w:t>
+            </w:r>
+          </w:p>
+        </w:tc>
+        <w:tc>
+          <w:tcPr>
+            <w:tcW w:type="dxa" w:w="2098"/>
+          </w:tcPr>
+          <w:p>
+            <w:pPr>
+              <w:spacing w:before="40" w:after="40"/>
+            </w:pPr>
+            <w:r>
+              <w:rPr>
+                <w:rFonts w:ascii="Consolas" w:hAnsi="Consolas" w:cs="Consolas"/>
+                <w:sz w:val="18"/>
+              </w:rPr>
+              <w:t>config</w:t>
+            </w:r>
+            <w:r>
+              <w:rPr>
+                <w:sz w:val="18"/>
+              </w:rPr>
+              <w:t xml:space="preserve">, </w:t>
+            </w:r>
+            <w:r>
+              <w:rPr>
+                <w:rFonts w:ascii="Consolas" w:hAnsi="Consolas" w:cs="Consolas"/>
+                <w:sz w:val="18"/>
+              </w:rPr>
+              <w:t>db</w:t>
+            </w:r>
+            <w:r>
+              <w:rPr>
+                <w:sz w:val="18"/>
+              </w:rPr>
+              <w:t xml:space="preserve">, </w:t>
+            </w:r>
+            <w:r>
+              <w:rPr>
+                <w:rFonts w:ascii="Consolas" w:hAnsi="Consolas" w:cs="Consolas"/>
+                <w:sz w:val="18"/>
+              </w:rPr>
+              <w:t>metrics</w:t>
+            </w:r>
+            <w:r>
+              <w:rPr>
+                <w:sz w:val="18"/>
+              </w:rPr>
+              <w:t xml:space="preserve">, </w:t>
+            </w:r>
+            <w:r>
+              <w:rPr>
+                <w:rFonts w:ascii="Consolas" w:hAnsi="Consolas" w:cs="Consolas"/>
+                <w:sz w:val="18"/>
+              </w:rPr>
+              <w:t>redisClient</w:t>
+            </w:r>
+          </w:p>
+        </w:tc>
+      </w:tr>
+      <w:tr>
+        <w:tc>
+          <w:tcPr>
+            <w:tcW w:type="dxa" w:w="1814"/>
+          </w:tcPr>
+          <w:p>
+            <w:pPr>
+              <w:spacing w:before="40" w:after="40"/>
+            </w:pPr>
+            <w:r>
+              <w:rPr>
+                <w:rFonts w:ascii="Consolas" w:hAnsi="Consolas" w:cs="Consolas"/>
+                <w:sz w:val="18"/>
+              </w:rPr>
+              <w:t>auth.js</w:t>
+            </w:r>
+          </w:p>
+        </w:tc>
+        <w:tc>
+          <w:tcPr>
+            <w:tcW w:type="dxa" w:w="5102"/>
+          </w:tcPr>
+          <w:p>
+            <w:pPr>
+              <w:spacing w:before="40" w:after="40"/>
+            </w:pPr>
+            <w:r>
+              <w:rPr>
+                <w:sz w:val="18"/>
+              </w:rPr>
+              <w:t>JWT por nombre de jugador, sin contraseña: no es el objetivo didáctico de este proyecto.</w:t>
+            </w:r>
+          </w:p>
+        </w:tc>
+        <w:tc>
+          <w:tcPr>
+            <w:tcW w:type="dxa" w:w="2098"/>
+          </w:tcPr>
+          <w:p>
+            <w:pPr>
+              <w:spacing w:before="40" w:after="40"/>
+            </w:pPr>
+            <w:r>
+              <w:rPr>
+                <w:rFonts w:ascii="Consolas" w:hAnsi="Consolas" w:cs="Consolas"/>
+                <w:sz w:val="18"/>
+              </w:rPr>
+              <w:t>config</w:t>
+            </w:r>
+          </w:p>
+        </w:tc>
+      </w:tr>
+      <w:tr>
+        <w:tc>
+          <w:tcPr>
+            <w:tcW w:type="dxa" w:w="1814"/>
+          </w:tcPr>
+          <w:p>
+            <w:pPr>
+              <w:spacing w:before="40" w:after="40"/>
+            </w:pPr>
+            <w:r>
+              <w:rPr>
+                <w:rFonts w:ascii="Consolas" w:hAnsi="Consolas" w:cs="Consolas"/>
+                <w:sz w:val="18"/>
+              </w:rPr>
+              <w:t>redisClient.js</w:t>
+            </w:r>
+          </w:p>
+        </w:tc>
+        <w:tc>
+          <w:tcPr>
+            <w:tcW w:type="dxa" w:w="5102"/>
+          </w:tcPr>
+          <w:p>
+            <w:pPr>
+              <w:spacing w:before="40" w:after="40"/>
+            </w:pPr>
+            <w:r>
+              <w:rPr>
+                <w:sz w:val="18"/>
+              </w:rPr>
+              <w:t>Los tres papeles de Redis: cola de espera, leaderboard cacheado y pub/sub entre réplicas.</w:t>
+            </w:r>
+          </w:p>
+        </w:tc>
+        <w:tc>
+          <w:tcPr>
+            <w:tcW w:type="dxa" w:w="2098"/>
+          </w:tcPr>
+          <w:p>
+            <w:pPr>
+              <w:spacing w:before="40" w:after="40"/>
+            </w:pPr>
+            <w:r>
+              <w:rPr>
+                <w:rFonts w:ascii="Consolas" w:hAnsi="Consolas" w:cs="Consolas"/>
+                <w:sz w:val="18"/>
+              </w:rPr>
+              <w:t>config</w:t>
+            </w:r>
+          </w:p>
+        </w:tc>
+      </w:tr>
+      <w:tr>
+        <w:tc>
+          <w:tcPr>
+            <w:tcW w:type="dxa" w:w="1814"/>
+          </w:tcPr>
+          <w:p>
+            <w:pPr>
+              <w:spacing w:before="40" w:after="40"/>
+            </w:pPr>
+            <w:r>
+              <w:rPr>
+                <w:rFonts w:ascii="Consolas" w:hAnsi="Consolas" w:cs="Consolas"/>
+                <w:sz w:val="18"/>
+              </w:rPr>
+              <w:t>db.js</w:t>
+            </w:r>
+          </w:p>
+        </w:tc>
+        <w:tc>
+          <w:tcPr>
+            <w:tcW w:type="dxa" w:w="5102"/>
+          </w:tcPr>
+          <w:p>
+            <w:pPr>
+              <w:spacing w:before="40" w:after="40"/>
+            </w:pPr>
+            <w:r>
+              <w:rPr>
+                <w:sz w:val="18"/>
+              </w:rPr>
+              <w:t>PostgreSQL: jugadores, partidas y puntuaciones. Es la persistencia definitiva; Redis guarda solo el estado «en vivo».</w:t>
+            </w:r>
+          </w:p>
+        </w:tc>
+        <w:tc>
+          <w:tcPr>
+            <w:tcW w:type="dxa" w:w="2098"/>
+          </w:tcPr>
+          <w:p>
+            <w:pPr>
+              <w:spacing w:before="40" w:after="40"/>
+            </w:pPr>
+            <w:r>
+              <w:rPr>
+                <w:rFonts w:ascii="Consolas" w:hAnsi="Consolas" w:cs="Consolas"/>
+                <w:sz w:val="18"/>
+              </w:rPr>
+              <w:t>config</w:t>
+            </w:r>
+          </w:p>
+        </w:tc>
+      </w:tr>
+      <w:tr>
+        <w:tc>
+          <w:tcPr>
+            <w:tcW w:type="dxa" w:w="1814"/>
+          </w:tcPr>
+          <w:p>
+            <w:pPr>
+              <w:spacing w:before="40" w:after="40"/>
+            </w:pPr>
+            <w:r>
+              <w:rPr>
+                <w:rFonts w:ascii="Consolas" w:hAnsi="Consolas" w:cs="Consolas"/>
+                <w:sz w:val="18"/>
+              </w:rPr>
+              <w:t>metrics.js</w:t>
+            </w:r>
+          </w:p>
+        </w:tc>
+        <w:tc>
+          <w:tcPr>
+            <w:tcW w:type="dxa" w:w="5102"/>
+          </w:tcPr>
+          <w:p>
+            <w:pPr>
+              <w:spacing w:before="40" w:after="40"/>
+            </w:pPr>
+            <w:r>
+              <w:rPr>
+                <w:sz w:val="18"/>
+              </w:rPr>
+              <w:t xml:space="preserve">Métricas en texto plano estilo Prometheus, servidas en </w:t>
+            </w:r>
+            <w:r>
+              <w:rPr>
+                <w:rFonts w:ascii="Consolas" w:hAnsi="Consolas" w:cs="Consolas"/>
+                <w:sz w:val="18"/>
+              </w:rPr>
+              <w:t>/metrics</w:t>
+            </w:r>
+            <w:r>
+              <w:rPr>
+                <w:sz w:val="18"/>
+              </w:rPr>
+              <w:t>.</w:t>
+            </w:r>
+          </w:p>
+        </w:tc>
+        <w:tc>
+          <w:tcPr>
+            <w:tcW w:type="dxa" w:w="2098"/>
+          </w:tcPr>
+          <w:p>
+            <w:pPr>
+              <w:spacing w:before="40" w:after="40"/>
+            </w:pPr>
+            <w:r>
+              <w:rPr>
+                <w:rFonts w:ascii="Consolas" w:hAnsi="Consolas" w:cs="Consolas"/>
+                <w:sz w:val="18"/>
+              </w:rPr>
+              <w:t>redisClient</w:t>
+            </w:r>
+          </w:p>
+        </w:tc>
+      </w:tr>
+      <w:tr>
+        <w:tc>
+          <w:tcPr>
+            <w:tcW w:type="dxa" w:w="1814"/>
+          </w:tcPr>
+          <w:p>
+            <w:pPr>
+              <w:spacing w:before="40" w:after="40"/>
+            </w:pPr>
+            <w:r>
+              <w:rPr>
+                <w:rFonts w:ascii="Consolas" w:hAnsi="Consolas" w:cs="Consolas"/>
+                <w:sz w:val="18"/>
+              </w:rPr>
+              <w:t>config.js</w:t>
+            </w:r>
+          </w:p>
+        </w:tc>
+        <w:tc>
+          <w:tcPr>
+            <w:tcW w:type="dxa" w:w="5102"/>
+          </w:tcPr>
+          <w:p>
+            <w:pPr>
+              <w:spacing w:before="40" w:after="40"/>
+            </w:pPr>
+            <w:r>
+              <w:rPr>
+                <w:sz w:val="18"/>
+              </w:rPr>
+              <w:t xml:space="preserve">Toda la configuración. Si </w:t>
+            </w:r>
+            <w:r>
+              <w:rPr>
+                <w:rFonts w:ascii="Consolas" w:hAnsi="Consolas" w:cs="Consolas"/>
+                <w:sz w:val="18"/>
+              </w:rPr>
+              <w:t>JWT_SECRET</w:t>
+            </w:r>
+            <w:r>
+              <w:rPr>
+                <w:sz w:val="18"/>
+              </w:rPr>
+              <w:t xml:space="preserve"> no está definido, </w:t>
+            </w:r>
+            <w:r>
+              <w:rPr>
+                <w:b/>
+                <w:sz w:val="18"/>
+              </w:rPr>
+              <w:t>el proceso no arranca</w:t>
+            </w:r>
+            <w:r>
+              <w:rPr>
+                <w:sz w:val="18"/>
+              </w:rPr>
+              <w:t>: es deliberado, y es el escenario 2 de diagnóstico.</w:t>
+            </w:r>
+          </w:p>
+        </w:tc>
+        <w:tc>
+          <w:tcPr>
+            <w:tcW w:type="dxa" w:w="2098"/>
+          </w:tcPr>
+          <w:p>
+            <w:pPr>
+              <w:spacing w:before="40" w:after="40"/>
+            </w:pPr>
+            <w:r>
+              <w:rPr>
+                <w:sz w:val="18"/>
+              </w:rPr>
+              <w:t>—</w:t>
+            </w:r>
+          </w:p>
+        </w:tc>
+      </w:tr>
+    </w:tbl>
+    <w:p>
+      <w:pPr>
+        <w:spacing w:after="40"/>
+      </w:pPr>
+    </w:p>
+    <w:p>
+      <w:pPr>
+        <w:pStyle w:val="Heading3"/>
+      </w:pPr>
+      <w:r>
+        <w:t>El recorrido de una partida</w:t>
+      </w:r>
+    </w:p>
+    <w:p>
+      <w:pPr>
+        <w:spacing w:after="80"/>
+        <w:ind w:left="425" w:hanging="425"/>
+      </w:pPr>
+      <w:r>
+        <w:rPr>
+          <w:b/>
+        </w:rPr>
+        <w:t xml:space="preserve">1.  </w:t>
+      </w:r>
+      <w:r>
+        <w:rPr/>
+        <w:t xml:space="preserve">El navegador llama a </w:t>
+      </w:r>
+      <w:r>
+        <w:rPr>
+          <w:rFonts w:ascii="Consolas" w:hAnsi="Consolas" w:cs="Consolas"/>
+          <w:sz w:val="19"/>
+        </w:rPr>
+        <w:t>POST /api/players</w:t>
+      </w:r>
+      <w:r>
+        <w:rPr/>
+        <w:t xml:space="preserve">. </w:t>
+      </w:r>
+      <w:r>
+        <w:rPr>
+          <w:rFonts w:ascii="Consolas" w:hAnsi="Consolas" w:cs="Consolas"/>
+          <w:sz w:val="19"/>
+        </w:rPr>
+        <w:t>routes.js</w:t>
+      </w:r>
+      <w:r>
+        <w:rPr/>
+        <w:t xml:space="preserve"> pide a </w:t>
+      </w:r>
+      <w:r>
+        <w:rPr>
+          <w:rFonts w:ascii="Consolas" w:hAnsi="Consolas" w:cs="Consolas"/>
+          <w:sz w:val="19"/>
+        </w:rPr>
+        <w:t>auth.js</w:t>
+      </w:r>
+      <w:r>
+        <w:rPr/>
+        <w:t xml:space="preserve"> un JWT y guarda el jugador con </w:t>
+      </w:r>
+      <w:r>
+        <w:rPr>
+          <w:rFonts w:ascii="Consolas" w:hAnsi="Consolas" w:cs="Consolas"/>
+          <w:sz w:val="19"/>
+        </w:rPr>
+        <w:t>db.js</w:t>
+      </w:r>
+      <w:r>
+        <w:rPr/>
+        <w:t>.</w:t>
+      </w:r>
+    </w:p>
+    <w:p>
+      <w:pPr>
+        <w:spacing w:after="80"/>
+        <w:ind w:left="425" w:hanging="425"/>
+      </w:pPr>
+      <w:r>
+        <w:rPr>
+          <w:b/>
+        </w:rPr>
+        <w:t xml:space="preserve">2.  </w:t>
+      </w:r>
+      <w:r>
+        <w:rPr/>
+        <w:t xml:space="preserve">El navegador abre el WebSocket. </w:t>
+      </w:r>
+      <w:r>
+        <w:rPr>
+          <w:rFonts w:ascii="Consolas" w:hAnsi="Consolas" w:cs="Consolas"/>
+          <w:sz w:val="19"/>
+        </w:rPr>
+        <w:t>sockets.js</w:t>
+      </w:r>
+      <w:r>
+        <w:rPr/>
+        <w:t xml:space="preserve"> verifica el token, otra vez con </w:t>
+      </w:r>
+      <w:r>
+        <w:rPr>
+          <w:rFonts w:ascii="Consolas" w:hAnsi="Consolas" w:cs="Consolas"/>
+          <w:sz w:val="19"/>
+        </w:rPr>
+        <w:t>auth.js</w:t>
+      </w:r>
+      <w:r>
+        <w:rPr/>
+        <w:t>.</w:t>
+      </w:r>
+    </w:p>
+    <w:p>
+      <w:pPr>
+        <w:spacing w:after="80"/>
+        <w:ind w:left="425" w:hanging="425"/>
+      </w:pPr>
+      <w:r>
+        <w:rPr>
+          <w:b/>
+        </w:rPr>
+        <w:t xml:space="preserve">3.  </w:t>
+      </w:r>
+      <w:r>
+        <w:rPr/>
+        <w:t xml:space="preserve">El jugador pide partida: </w:t>
+      </w:r>
+      <w:r>
+        <w:rPr>
+          <w:rFonts w:ascii="Consolas" w:hAnsi="Consolas" w:cs="Consolas"/>
+          <w:sz w:val="19"/>
+        </w:rPr>
+        <w:t>sockets.js</w:t>
+      </w:r>
+      <w:r>
+        <w:rPr/>
+        <w:t xml:space="preserve"> llama a </w:t>
+      </w:r>
+      <w:r>
+        <w:rPr>
+          <w:rFonts w:ascii="Consolas" w:hAnsi="Consolas" w:cs="Consolas"/>
+          <w:sz w:val="19"/>
+        </w:rPr>
+        <w:t>matchmaking.enqueuePlayer</w:t>
+      </w:r>
+      <w:r>
+        <w:rPr/>
+        <w:t>, que lo mete en la lista de espera de Redis.</w:t>
+      </w:r>
+    </w:p>
+    <w:p>
+      <w:pPr>
+        <w:spacing w:after="80"/>
+        <w:ind w:left="425" w:hanging="425"/>
+      </w:pPr>
+      <w:r>
+        <w:rPr>
+          <w:b/>
+        </w:rPr>
+        <w:t xml:space="preserve">4.  </w:t>
+      </w:r>
+      <w:r>
+        <w:rPr/>
+        <w:t xml:space="preserve">El bucle de emparejamiento —que arrancó </w:t>
+      </w:r>
+      <w:r>
+        <w:rPr>
+          <w:rFonts w:ascii="Consolas" w:hAnsi="Consolas" w:cs="Consolas"/>
+          <w:sz w:val="19"/>
+        </w:rPr>
+        <w:t>server.js</w:t>
+      </w:r>
+      <w:r>
+        <w:rPr/>
+        <w:t xml:space="preserve">, no el WebSocket— saca dos jugadores de esa lista, crea la partida con </w:t>
+      </w:r>
+      <w:r>
+        <w:rPr>
+          <w:rFonts w:ascii="Consolas" w:hAnsi="Consolas" w:cs="Consolas"/>
+          <w:sz w:val="19"/>
+        </w:rPr>
+        <w:t>db.js</w:t>
+      </w:r>
+      <w:r>
+        <w:rPr/>
+        <w:t xml:space="preserve"> y </w:t>
+      </w:r>
+      <w:r>
+        <w:rPr>
+          <w:b/>
+        </w:rPr>
+        <w:t>publica el evento por el pub/sub de Redis</w:t>
+      </w:r>
+      <w:r>
+        <w:rPr/>
+        <w:t>.</w:t>
+      </w:r>
+    </w:p>
+    <w:p>
+      <w:pPr>
+        <w:spacing w:after="80"/>
+        <w:ind w:left="425" w:hanging="425"/>
+      </w:pPr>
+      <w:r>
+        <w:rPr>
+          <w:b/>
+        </w:rPr>
+        <w:t xml:space="preserve">5.  </w:t>
+      </w:r>
+      <w:r>
+        <w:rPr/>
+        <w:t xml:space="preserve">Todas las réplicas del backend están suscritas a ese canal. La que tenga conectado a cada jugador recibe el evento en </w:t>
+      </w:r>
+      <w:r>
+        <w:rPr>
+          <w:rFonts w:ascii="Consolas" w:hAnsi="Consolas" w:cs="Consolas"/>
+          <w:sz w:val="19"/>
+        </w:rPr>
+        <w:t>sockets.js</w:t>
+      </w:r>
+      <w:r>
+        <w:rPr/>
+        <w:t xml:space="preserve"> y se lo entrega.</w:t>
+      </w:r>
+    </w:p>
+    <w:p>
+      <w:pPr>
+        <w:spacing w:after="80"/>
+        <w:ind w:left="425" w:hanging="425"/>
+      </w:pPr>
+      <w:r>
+        <w:rPr>
+          <w:b/>
+        </w:rPr>
+        <w:t xml:space="preserve">6.  </w:t>
+      </w:r>
+      <w:r>
+        <w:rPr/>
+        <w:t xml:space="preserve">Al terminar la ronda, </w:t>
+      </w:r>
+      <w:r>
+        <w:rPr>
+          <w:rFonts w:ascii="Consolas" w:hAnsi="Consolas" w:cs="Consolas"/>
+          <w:sz w:val="19"/>
+        </w:rPr>
+        <w:t>matchmaking.js</w:t>
+      </w:r>
+      <w:r>
+        <w:rPr/>
+        <w:t xml:space="preserve"> guarda el resultado en Postgres y actualiza el leaderboard cacheado en Redis.</w:t>
+      </w:r>
+    </w:p>
+    <w:tbl>
+      <w:tblPr>
+        <w:tblW w:type="auto" w:w="0"/>
+        <w:tblLook w:firstColumn="1" w:firstRow="1" w:lastColumn="0" w:lastRow="0" w:noHBand="0" w:noVBand="1" w:val="04A0"/>
+        <w:tblBorders>
+          <w:top w:val="single" w:sz="4" w:space="0" w:color="E69138"/>
+          <w:left w:val="single" w:sz="4" w:space="0" w:color="E69138"/>
+          <w:bottom w:val="single" w:sz="4" w:space="0" w:color="E69138"/>
+          <w:right w:val="single" w:sz="4" w:space="0" w:color="E69138"/>
+          <w:insideH w:val="single" w:sz="4" w:space="0" w:color="E69138"/>
+          <w:insideV w:val="single" w:sz="4" w:space="0" w:color="E69138"/>
+        </w:tblBorders>
+      </w:tblPr>
+      <w:tblGrid>
+        <w:gridCol w:w="9026"/>
+      </w:tblGrid>
+      <w:tr>
+        <w:tc>
+          <w:tcPr>
+            <w:tcW w:type="dxa" w:w="9014"/>
+            <w:shd w:val="clear" w:color="auto" w:fill="FFF3E0"/>
+          </w:tcPr>
+          <w:p>
+            <w:pPr>
+              <w:spacing w:before="80" w:after="80"/>
+            </w:pPr>
+            <w:r>
+              <w:rPr>
+                <w:b/>
+                <w:color w:val="B45F06"/>
+                <w:sz w:val="19"/>
+              </w:rPr>
+              <w:t>Por qué este mapa explica el ejercicio de las dos réplicas</w:t>
+            </w:r>
+          </w:p>
+          <w:p>
+            <w:pPr>
+              <w:spacing w:after="80"/>
+            </w:pPr>
+            <w:r>
+              <w:rPr>
+                <w:sz w:val="19"/>
+              </w:rPr>
+              <w:t xml:space="preserve">El paso 4 es la clave: </w:t>
+            </w:r>
+            <w:r>
+              <w:rPr>
+                <w:rFonts w:ascii="Consolas" w:hAnsi="Consolas" w:cs="Consolas"/>
+                <w:b/>
+                <w:sz w:val="19"/>
+              </w:rPr>
+              <w:t>matchmaking.js</w:t>
+            </w:r>
+            <w:r>
+              <w:rPr>
+                <w:b/>
+                <w:sz w:val="19"/>
+              </w:rPr>
+              <w:t xml:space="preserve"> puede emparejar a dos jugadores que están conectados a réplicas distintas</w:t>
+            </w:r>
+            <w:r>
+              <w:rPr>
+                <w:sz w:val="19"/>
+              </w:rPr>
+              <w:t>, porque no habla con Socket.IO sino con Redis. Sin el pub/sub, la réplica que crea la partida no tendría forma de avisar a un jugador que no es suyo.</w:t>
+            </w:r>
+          </w:p>
+          <w:p>
+            <w:pPr>
+              <w:spacing w:after="80"/>
+            </w:pPr>
+            <w:r>
+              <w:rPr>
+                <w:sz w:val="19"/>
+              </w:rPr>
+              <w:t xml:space="preserve">Y también explica el problema que descubre el ejercicio 2: el estado de la </w:t>
+            </w:r>
+            <w:r>
+              <w:rPr>
+                <w:b/>
+                <w:sz w:val="19"/>
+              </w:rPr>
+              <w:t>conexión</w:t>
+            </w:r>
+            <w:r>
+              <w:rPr>
+                <w:sz w:val="19"/>
+              </w:rPr>
+              <w:t xml:space="preserve"> WebSocket sí es de una réplica concreta. Repartir peticiones entre dos réplicas está bien para la API REST y es un problema para el WebSocket, y la razón está en qué módulo guarda qué.</w:t>
+            </w:r>
+          </w:p>
+        </w:tc>
+      </w:tr>
+    </w:tbl>
+    <w:p>
+      <w:pPr>
+        <w:spacing w:after="40"/>
+      </w:pPr>
+    </w:p>
+    <w:p>
+      <w:pPr>
         <w:pStyle w:val="Heading1"/>
         <w:spacing w:after="200" w:before="400"/>
       </w:pPr>
@@ -626,7 +1982,7 @@
         <w:spacing w:after="60"/>
       </w:pPr>
       <w:r>
-        <w:t xml:space="preserve">El puerto 80 del host libre (o cambiar HTTP_PORT en .env si está ocupado, ver sección de diagnóstico).</w:t>
+        <w:t xml:space="preserve">El puerto 8080 del host libre (o cambiar HTTP_PORT en .env si está ocupado, ver sección de diagnóstico).</w:t>
       </w:r>
     </w:p>
     <w:p>
@@ -800,7 +2156,7 @@
           <w:sz w:val="20"/>
           <w:szCs w:val="20"/>
         </w:rPr>
-        <w:t xml:space="preserve">curl http://localhost/api/health</w:t>
+        <w:t xml:space="preserve">curl http://localhost:8080/api/health</w:t>
       </w:r>
     </w:p>
     <w:p>
@@ -816,7 +2172,7 @@
         <w:spacing w:after="150"/>
       </w:pPr>
       <w:r>
-        <w:t xml:space="preserve">Finalmente, abre un navegador en http://localhost/, regístrate con un nombre de jugador y comprueba que el leaderboard (aunque esté vacío) se carga sin errores en la consola del navegador.</w:t>
+        <w:t xml:space="preserve">Finalmente, abre un navegador en http://localhost:8080/, regístrate con un nombre de jugador y comprueba que el leaderboard (aunque esté vacío) se carga sin errores en la consola del navegador.</w:t>
       </w:r>
     </w:p>
     <w:p>
@@ -1684,7 +3040,7 @@
         <w:spacing w:after="60"/>
       </w:pPr>
       <w:r>
-        <w:t xml:space="preserve">Ocupa el puerto 80 con otro proceso, por ejemplo levantando un servidor cualquiera en ese puerto, o cambia temporalmente HTTP_PORT en .env a un puerto que sepas que ya está en uso en tu máquina.</w:t>
+        <w:t xml:space="preserve">Ocupa el puerto 8080 con otro proceso, por ejemplo levantando un servidor cualquiera en ese puerto, o cambia temporalmente HTTP_PORT en .env a un puerto que sepas que ya está en uso en tu máquina.</w:t>
       </w:r>
     </w:p>
     <w:p>
@@ -1712,7 +3068,7 @@
         <w:t xml:space="preserve">Pistas de diagnóstico: </w:t>
       </w:r>
       <w:r>
-        <w:t xml:space="preserve">Fíjate en el mensaje de error que da Docker (no Node.js: este fallo ocurre al intentar publicar el puerto, antes de que el contenedor de nginx llegue a arrancar realmente el proceso). Comprueba con docker compose ps qué servicios han quedado arriba y cuál no. En un sistema Linux/Mac puedes averiguar qué proceso ocupa un puerto con sudo lsof -i :80 o sudo ss -ltnp | grep :80; en Windows, con netstat -ano | findstr :80. ¿Cómo solucionarías esto sin liberar el puerto 80?</w:t>
+        <w:t xml:space="preserve">Fíjate en el mensaje de error que da Docker (no Node.js: este fallo ocurre al intentar publicar el puerto, antes de que el contenedor de nginx llegue a arrancar realmente el proceso). Comprueba con docker compose ps qué servicios han quedado arriba y cuál no. En un sistema Linux/Mac puedes averiguar qué proceso ocupa un puerto con sudo lsof -i :8080 o sudo ss -ltnp | grep :8080; en Windows, con netstat -ano | findstr :8080. ¿Cómo solucionarías esto sin liberar el puerto 8080?</w:t>
       </w:r>
     </w:p>
     <w:p>

</xml_diff>